<commit_message>
Se sube modificaciones y diagramas para el proyecto.
</commit_message>
<xml_diff>
--- a/documentacion.docx
+++ b/documentacion.docx
@@ -181,35 +181,21 @@
           <w:b/>
           <w:bCs/>
         </w:rPr>
-        <w:t>Cuidado Seguro</w:t>
+        <w:t xml:space="preserve">Cuidado Seguro </w:t>
       </w:r>
       <w:r>
         <w:rPr>
           <w:b/>
           <w:bCs/>
         </w:rPr>
-        <w:t xml:space="preserve"> </w:t>
+        <w:t xml:space="preserve">– </w:t>
       </w:r>
       <w:r>
         <w:rPr>
           <w:b/>
           <w:bCs/>
         </w:rPr>
-        <w:t xml:space="preserve">– </w:t>
-      </w:r>
-      <w:r>
-        <w:rPr>
-          <w:b/>
-          <w:bCs/>
-        </w:rPr>
-        <w:t>Plataforma Web para la Gestión de Pacientes Institucionalizados</w:t>
-      </w:r>
-      <w:r>
-        <w:rPr>
-          <w:b/>
-          <w:bCs/>
-        </w:rPr>
-        <w:t xml:space="preserve"> </w:t>
+        <w:t xml:space="preserve">Plataforma Web para la Gestión de Pacientes Institucionalizados </w:t>
       </w:r>
       <w:r>
         <w:rPr>
@@ -1544,21 +1530,7 @@
         <w:rPr>
           <w:lang w:val="en-US"/>
         </w:rPr>
-        <w:t xml:space="preserve"> </w:t>
-      </w:r>
-      <w:proofErr w:type="spellStart"/>
-      <w:r>
-        <w:rPr>
-          <w:lang w:val="en-US"/>
-        </w:rPr>
-        <w:t>en</w:t>
-      </w:r>
-      <w:proofErr w:type="spellEnd"/>
-      <w:r>
-        <w:rPr>
-          <w:lang w:val="en-US"/>
-        </w:rPr>
-        <w:t xml:space="preserve"> AWS S3. </w:t>
+        <w:t xml:space="preserve"> en AWS S3. </w:t>
       </w:r>
     </w:p>
     <w:p>
@@ -1710,8 +1682,208 @@
         <w:t xml:space="preserve">. </w:t>
       </w:r>
     </w:p>
+    <w:p>
+      <w:pPr>
+        <w:rPr>
+          <w:b/>
+          <w:bCs/>
+        </w:rPr>
+      </w:pPr>
+      <w:r>
+        <w:rPr>
+          <w:b/>
+          <w:bCs/>
+        </w:rPr>
+        <w:br w:type="page"/>
+      </w:r>
+    </w:p>
+    <w:p>
+      <w:pPr>
+        <w:ind w:left="360"/>
+        <w:jc w:val="both"/>
+        <w:rPr>
+          <w:b/>
+          <w:bCs/>
+        </w:rPr>
+      </w:pPr>
+      <w:r>
+        <w:rPr>
+          <w:b/>
+          <w:bCs/>
+        </w:rPr>
+        <w:lastRenderedPageBreak/>
+        <w:t>Diagrama</w:t>
+      </w:r>
+      <w:r>
+        <w:rPr>
+          <w:b/>
+          <w:bCs/>
+        </w:rPr>
+        <w:t>s</w:t>
+      </w:r>
+      <w:r>
+        <w:rPr>
+          <w:b/>
+          <w:bCs/>
+        </w:rPr>
+        <w:t>:</w:t>
+      </w:r>
+    </w:p>
+    <w:p>
+      <w:pPr>
+        <w:ind w:left="360"/>
+        <w:jc w:val="both"/>
+        <w:rPr>
+          <w:b/>
+          <w:bCs/>
+        </w:rPr>
+      </w:pPr>
+    </w:p>
+    <w:p>
+      <w:pPr>
+        <w:pStyle w:val="Prrafodelista"/>
+        <w:numPr>
+          <w:ilvl w:val="0"/>
+          <w:numId w:val="51"/>
+        </w:numPr>
+        <w:jc w:val="both"/>
+      </w:pPr>
+      <w:r>
+        <w:t>Diagrama de arquitectura completo:</w:t>
+      </w:r>
+    </w:p>
+    <w:p>
+      <w:pPr>
+        <w:jc w:val="both"/>
+        <w:rPr>
+          <w:b/>
+          <w:bCs/>
+        </w:rPr>
+      </w:pPr>
+      <w:r>
+        <w:rPr>
+          <w:b/>
+          <w:bCs/>
+          <w:noProof/>
+        </w:rPr>
+        <w:drawing>
+          <wp:inline distT="0" distB="0" distL="0" distR="0" wp14:anchorId="7F62DD12" wp14:editId="28207C47">
+            <wp:extent cx="4616583" cy="6737350"/>
+            <wp:effectExtent l="0" t="0" r="0" b="6350"/>
+            <wp:docPr id="880184724" name="Imagen 3"/>
+            <wp:cNvGraphicFramePr>
+              <a:graphicFrameLocks xmlns:a="http://schemas.openxmlformats.org/drawingml/2006/main" noChangeAspect="1"/>
+            </wp:cNvGraphicFramePr>
+            <a:graphic xmlns:a="http://schemas.openxmlformats.org/drawingml/2006/main">
+              <a:graphicData uri="http://schemas.openxmlformats.org/drawingml/2006/picture">
+                <pic:pic xmlns:pic="http://schemas.openxmlformats.org/drawingml/2006/picture">
+                  <pic:nvPicPr>
+                    <pic:cNvPr id="880184724" name="Imagen 880184724"/>
+                    <pic:cNvPicPr/>
+                  </pic:nvPicPr>
+                  <pic:blipFill>
+                    <a:blip r:embed="rId7" cstate="print">
+                      <a:extLst>
+                        <a:ext uri="{28A0092B-C50C-407E-A947-70E740481C1C}">
+                          <a14:useLocalDpi xmlns:a14="http://schemas.microsoft.com/office/drawing/2010/main" val="0"/>
+                        </a:ext>
+                      </a:extLst>
+                    </a:blip>
+                    <a:stretch>
+                      <a:fillRect/>
+                    </a:stretch>
+                  </pic:blipFill>
+                  <pic:spPr>
+                    <a:xfrm>
+                      <a:off x="0" y="0"/>
+                      <a:ext cx="4621753" cy="6744895"/>
+                    </a:xfrm>
+                    <a:prstGeom prst="rect">
+                      <a:avLst/>
+                    </a:prstGeom>
+                  </pic:spPr>
+                </pic:pic>
+              </a:graphicData>
+            </a:graphic>
+          </wp:inline>
+        </w:drawing>
+      </w:r>
+    </w:p>
+    <w:p>
+      <w:pPr>
+        <w:jc w:val="both"/>
+        <w:rPr>
+          <w:sz w:val="16"/>
+          <w:szCs w:val="16"/>
+        </w:rPr>
+      </w:pPr>
+      <w:r>
+        <w:rPr>
+          <w:sz w:val="16"/>
+          <w:szCs w:val="16"/>
+        </w:rPr>
+        <w:t>Esta imagen está en el repositorio de la documentación.</w:t>
+      </w:r>
+    </w:p>
+    <w:p>
+      <w:pPr>
+        <w:jc w:val="both"/>
+        <w:rPr>
+          <w:rFonts w:ascii="Arial" w:hAnsi="Arial" w:cs="Arial"/>
+        </w:rPr>
+      </w:pPr>
+      <w:r>
+        <w:rPr>
+          <w:rFonts w:ascii="Arial" w:hAnsi="Arial" w:cs="Arial"/>
+        </w:rPr>
+        <w:lastRenderedPageBreak/>
+        <w:t xml:space="preserve">Se lleva a cabo la utilización de una arquitectura de microservicios que incorpora un API Gateway como punto central. Cada uno de los servicios utiliza el </w:t>
+      </w:r>
+      <w:proofErr w:type="spellStart"/>
+      <w:r>
+        <w:rPr>
+          <w:rFonts w:ascii="Arial" w:hAnsi="Arial" w:cs="Arial"/>
+        </w:rPr>
+        <w:t>Repository</w:t>
+      </w:r>
+      <w:proofErr w:type="spellEnd"/>
+      <w:r>
+        <w:rPr>
+          <w:rFonts w:ascii="Arial" w:hAnsi="Arial" w:cs="Arial"/>
+        </w:rPr>
+        <w:t xml:space="preserve"> </w:t>
+      </w:r>
+      <w:proofErr w:type="spellStart"/>
+      <w:r>
+        <w:rPr>
+          <w:rFonts w:ascii="Arial" w:hAnsi="Arial" w:cs="Arial"/>
+        </w:rPr>
+        <w:t>Pattern</w:t>
+      </w:r>
+      <w:proofErr w:type="spellEnd"/>
+      <w:r>
+        <w:rPr>
+          <w:rFonts w:ascii="Arial" w:hAnsi="Arial" w:cs="Arial"/>
+        </w:rPr>
+        <w:t xml:space="preserve"> para la persistencia. En el microservicio de autenticación se utiliza el patrón Factory Method para la creación de usuarios en función del rol. Finalmente, se incluye el circuito de ruptura (</w:t>
+      </w:r>
+      <w:proofErr w:type="spellStart"/>
+      <w:r>
+        <w:rPr>
+          <w:rFonts w:ascii="Arial" w:hAnsi="Arial" w:cs="Arial"/>
+        </w:rPr>
+        <w:t>Circuit</w:t>
+      </w:r>
+      <w:proofErr w:type="spellEnd"/>
+      <w:r>
+        <w:rPr>
+          <w:rFonts w:ascii="Arial" w:hAnsi="Arial" w:cs="Arial"/>
+        </w:rPr>
+        <w:t xml:space="preserve"> Breaker) en las comunicaciones entre los servicios para mejorar la resiliencia del sistema.</w:t>
+      </w:r>
+    </w:p>
     <w:sectPr>
-      <w:headerReference w:type="default" r:id="rId7"/>
+      <w:headerReference w:type="default" r:id="rId8"/>
       <w:pgSz w:w="12240" w:h="15840"/>
       <w:pgMar w:top="1417" w:right="1701" w:bottom="1417" w:left="1701" w:header="708" w:footer="708" w:gutter="0"/>
       <w:cols w:space="708"/>
@@ -3881,6 +4053,119 @@
     </w:lvl>
   </w:abstractNum>
   <w:abstractNum w:abstractNumId="14" w15:restartNumberingAfterBreak="0">
+    <w:nsid w:val="2B825BE8"/>
+    <w:multiLevelType w:val="hybridMultilevel"/>
+    <w:tmpl w:val="3BF0E73A"/>
+    <w:lvl w:ilvl="0" w:tplc="340A0001">
+      <w:start w:val="1"/>
+      <w:numFmt w:val="bullet"/>
+      <w:lvlText w:val=""/>
+      <w:lvlJc w:val="left"/>
+      <w:pPr>
+        <w:ind w:left="1430" w:hanging="360"/>
+      </w:pPr>
+      <w:rPr>
+        <w:rFonts w:ascii="Symbol" w:hAnsi="Symbol" w:hint="default"/>
+      </w:rPr>
+    </w:lvl>
+    <w:lvl w:ilvl="1" w:tplc="340A0003" w:tentative="1">
+      <w:start w:val="1"/>
+      <w:numFmt w:val="bullet"/>
+      <w:lvlText w:val="o"/>
+      <w:lvlJc w:val="left"/>
+      <w:pPr>
+        <w:ind w:left="2150" w:hanging="360"/>
+      </w:pPr>
+      <w:rPr>
+        <w:rFonts w:ascii="Courier New" w:hAnsi="Courier New" w:cs="Courier New" w:hint="default"/>
+      </w:rPr>
+    </w:lvl>
+    <w:lvl w:ilvl="2" w:tplc="340A0005" w:tentative="1">
+      <w:start w:val="1"/>
+      <w:numFmt w:val="bullet"/>
+      <w:lvlText w:val=""/>
+      <w:lvlJc w:val="left"/>
+      <w:pPr>
+        <w:ind w:left="2870" w:hanging="360"/>
+      </w:pPr>
+      <w:rPr>
+        <w:rFonts w:ascii="Wingdings" w:hAnsi="Wingdings" w:hint="default"/>
+      </w:rPr>
+    </w:lvl>
+    <w:lvl w:ilvl="3" w:tplc="340A0001" w:tentative="1">
+      <w:start w:val="1"/>
+      <w:numFmt w:val="bullet"/>
+      <w:lvlText w:val=""/>
+      <w:lvlJc w:val="left"/>
+      <w:pPr>
+        <w:ind w:left="3590" w:hanging="360"/>
+      </w:pPr>
+      <w:rPr>
+        <w:rFonts w:ascii="Symbol" w:hAnsi="Symbol" w:hint="default"/>
+      </w:rPr>
+    </w:lvl>
+    <w:lvl w:ilvl="4" w:tplc="340A0003" w:tentative="1">
+      <w:start w:val="1"/>
+      <w:numFmt w:val="bullet"/>
+      <w:lvlText w:val="o"/>
+      <w:lvlJc w:val="left"/>
+      <w:pPr>
+        <w:ind w:left="4310" w:hanging="360"/>
+      </w:pPr>
+      <w:rPr>
+        <w:rFonts w:ascii="Courier New" w:hAnsi="Courier New" w:cs="Courier New" w:hint="default"/>
+      </w:rPr>
+    </w:lvl>
+    <w:lvl w:ilvl="5" w:tplc="340A0005" w:tentative="1">
+      <w:start w:val="1"/>
+      <w:numFmt w:val="bullet"/>
+      <w:lvlText w:val=""/>
+      <w:lvlJc w:val="left"/>
+      <w:pPr>
+        <w:ind w:left="5030" w:hanging="360"/>
+      </w:pPr>
+      <w:rPr>
+        <w:rFonts w:ascii="Wingdings" w:hAnsi="Wingdings" w:hint="default"/>
+      </w:rPr>
+    </w:lvl>
+    <w:lvl w:ilvl="6" w:tplc="340A0001" w:tentative="1">
+      <w:start w:val="1"/>
+      <w:numFmt w:val="bullet"/>
+      <w:lvlText w:val=""/>
+      <w:lvlJc w:val="left"/>
+      <w:pPr>
+        <w:ind w:left="5750" w:hanging="360"/>
+      </w:pPr>
+      <w:rPr>
+        <w:rFonts w:ascii="Symbol" w:hAnsi="Symbol" w:hint="default"/>
+      </w:rPr>
+    </w:lvl>
+    <w:lvl w:ilvl="7" w:tplc="340A0003" w:tentative="1">
+      <w:start w:val="1"/>
+      <w:numFmt w:val="bullet"/>
+      <w:lvlText w:val="o"/>
+      <w:lvlJc w:val="left"/>
+      <w:pPr>
+        <w:ind w:left="6470" w:hanging="360"/>
+      </w:pPr>
+      <w:rPr>
+        <w:rFonts w:ascii="Courier New" w:hAnsi="Courier New" w:cs="Courier New" w:hint="default"/>
+      </w:rPr>
+    </w:lvl>
+    <w:lvl w:ilvl="8" w:tplc="340A0005" w:tentative="1">
+      <w:start w:val="1"/>
+      <w:numFmt w:val="bullet"/>
+      <w:lvlText w:val=""/>
+      <w:lvlJc w:val="left"/>
+      <w:pPr>
+        <w:ind w:left="7190" w:hanging="360"/>
+      </w:pPr>
+      <w:rPr>
+        <w:rFonts w:ascii="Wingdings" w:hAnsi="Wingdings" w:hint="default"/>
+      </w:rPr>
+    </w:lvl>
+  </w:abstractNum>
+  <w:abstractNum w:abstractNumId="15" w15:restartNumberingAfterBreak="0">
     <w:nsid w:val="2CDB79B0"/>
     <w:multiLevelType w:val="multilevel"/>
     <w:tmpl w:val="2B5CC426"/>
@@ -4029,7 +4314,7 @@
       </w:rPr>
     </w:lvl>
   </w:abstractNum>
-  <w:abstractNum w:abstractNumId="15" w15:restartNumberingAfterBreak="0">
+  <w:abstractNum w:abstractNumId="16" w15:restartNumberingAfterBreak="0">
     <w:nsid w:val="2F632801"/>
     <w:multiLevelType w:val="multilevel"/>
     <w:tmpl w:val="E02CACE6"/>
@@ -4178,7 +4463,7 @@
       </w:rPr>
     </w:lvl>
   </w:abstractNum>
-  <w:abstractNum w:abstractNumId="16" w15:restartNumberingAfterBreak="0">
+  <w:abstractNum w:abstractNumId="17" w15:restartNumberingAfterBreak="0">
     <w:nsid w:val="341C541C"/>
     <w:multiLevelType w:val="multilevel"/>
     <w:tmpl w:val="E5324FBA"/>
@@ -4327,7 +4612,7 @@
       </w:rPr>
     </w:lvl>
   </w:abstractNum>
-  <w:abstractNum w:abstractNumId="17" w15:restartNumberingAfterBreak="0">
+  <w:abstractNum w:abstractNumId="18" w15:restartNumberingAfterBreak="0">
     <w:nsid w:val="3707394E"/>
     <w:multiLevelType w:val="multilevel"/>
     <w:tmpl w:val="6A9695FE"/>
@@ -4476,7 +4761,7 @@
       </w:rPr>
     </w:lvl>
   </w:abstractNum>
-  <w:abstractNum w:abstractNumId="18" w15:restartNumberingAfterBreak="0">
+  <w:abstractNum w:abstractNumId="19" w15:restartNumberingAfterBreak="0">
     <w:nsid w:val="38C22C27"/>
     <w:multiLevelType w:val="multilevel"/>
     <w:tmpl w:val="3490F41E"/>
@@ -4625,7 +4910,7 @@
       </w:rPr>
     </w:lvl>
   </w:abstractNum>
-  <w:abstractNum w:abstractNumId="19" w15:restartNumberingAfterBreak="0">
+  <w:abstractNum w:abstractNumId="20" w15:restartNumberingAfterBreak="0">
     <w:nsid w:val="392D3E31"/>
     <w:multiLevelType w:val="hybridMultilevel"/>
     <w:tmpl w:val="23E698E4"/>
@@ -4738,7 +5023,7 @@
       </w:rPr>
     </w:lvl>
   </w:abstractNum>
-  <w:abstractNum w:abstractNumId="20" w15:restartNumberingAfterBreak="0">
+  <w:abstractNum w:abstractNumId="21" w15:restartNumberingAfterBreak="0">
     <w:nsid w:val="3A394B68"/>
     <w:multiLevelType w:val="multilevel"/>
     <w:tmpl w:val="4B5C7C90"/>
@@ -4887,7 +5172,7 @@
       </w:rPr>
     </w:lvl>
   </w:abstractNum>
-  <w:abstractNum w:abstractNumId="21" w15:restartNumberingAfterBreak="0">
+  <w:abstractNum w:abstractNumId="22" w15:restartNumberingAfterBreak="0">
     <w:nsid w:val="419F2173"/>
     <w:multiLevelType w:val="multilevel"/>
     <w:tmpl w:val="E7D69332"/>
@@ -5036,7 +5321,7 @@
       </w:rPr>
     </w:lvl>
   </w:abstractNum>
-  <w:abstractNum w:abstractNumId="22" w15:restartNumberingAfterBreak="0">
+  <w:abstractNum w:abstractNumId="23" w15:restartNumberingAfterBreak="0">
     <w:nsid w:val="45436286"/>
     <w:multiLevelType w:val="hybridMultilevel"/>
     <w:tmpl w:val="F670D6DA"/>
@@ -5149,7 +5434,7 @@
       </w:rPr>
     </w:lvl>
   </w:abstractNum>
-  <w:abstractNum w:abstractNumId="23" w15:restartNumberingAfterBreak="0">
+  <w:abstractNum w:abstractNumId="24" w15:restartNumberingAfterBreak="0">
     <w:nsid w:val="48C9060F"/>
     <w:multiLevelType w:val="multilevel"/>
     <w:tmpl w:val="53CC2056"/>
@@ -5298,7 +5583,7 @@
       </w:rPr>
     </w:lvl>
   </w:abstractNum>
-  <w:abstractNum w:abstractNumId="24" w15:restartNumberingAfterBreak="0">
+  <w:abstractNum w:abstractNumId="25" w15:restartNumberingAfterBreak="0">
     <w:nsid w:val="4B6C401B"/>
     <w:multiLevelType w:val="multilevel"/>
     <w:tmpl w:val="354037D2"/>
@@ -5447,7 +5732,7 @@
       </w:rPr>
     </w:lvl>
   </w:abstractNum>
-  <w:abstractNum w:abstractNumId="25" w15:restartNumberingAfterBreak="0">
+  <w:abstractNum w:abstractNumId="26" w15:restartNumberingAfterBreak="0">
     <w:nsid w:val="4F856FA8"/>
     <w:multiLevelType w:val="multilevel"/>
     <w:tmpl w:val="88D8576E"/>
@@ -5596,7 +5881,7 @@
       </w:rPr>
     </w:lvl>
   </w:abstractNum>
-  <w:abstractNum w:abstractNumId="26" w15:restartNumberingAfterBreak="0">
+  <w:abstractNum w:abstractNumId="27" w15:restartNumberingAfterBreak="0">
     <w:nsid w:val="5144719E"/>
     <w:multiLevelType w:val="multilevel"/>
     <w:tmpl w:val="1A2EA37E"/>
@@ -5745,7 +6030,7 @@
       </w:rPr>
     </w:lvl>
   </w:abstractNum>
-  <w:abstractNum w:abstractNumId="27" w15:restartNumberingAfterBreak="0">
+  <w:abstractNum w:abstractNumId="28" w15:restartNumberingAfterBreak="0">
     <w:nsid w:val="542D13F3"/>
     <w:multiLevelType w:val="multilevel"/>
     <w:tmpl w:val="091CDD14"/>
@@ -5894,7 +6179,7 @@
       </w:rPr>
     </w:lvl>
   </w:abstractNum>
-  <w:abstractNum w:abstractNumId="28" w15:restartNumberingAfterBreak="0">
+  <w:abstractNum w:abstractNumId="29" w15:restartNumberingAfterBreak="0">
     <w:nsid w:val="555450EC"/>
     <w:multiLevelType w:val="multilevel"/>
     <w:tmpl w:val="8528CE76"/>
@@ -6043,7 +6328,7 @@
       </w:rPr>
     </w:lvl>
   </w:abstractNum>
-  <w:abstractNum w:abstractNumId="29" w15:restartNumberingAfterBreak="0">
+  <w:abstractNum w:abstractNumId="30" w15:restartNumberingAfterBreak="0">
     <w:nsid w:val="56011B82"/>
     <w:multiLevelType w:val="multilevel"/>
     <w:tmpl w:val="F6FCCB1A"/>
@@ -6192,7 +6477,7 @@
       </w:rPr>
     </w:lvl>
   </w:abstractNum>
-  <w:abstractNum w:abstractNumId="30" w15:restartNumberingAfterBreak="0">
+  <w:abstractNum w:abstractNumId="31" w15:restartNumberingAfterBreak="0">
     <w:nsid w:val="56721575"/>
     <w:multiLevelType w:val="hybridMultilevel"/>
     <w:tmpl w:val="DD78EA4C"/>
@@ -6305,7 +6590,7 @@
       </w:rPr>
     </w:lvl>
   </w:abstractNum>
-  <w:abstractNum w:abstractNumId="31" w15:restartNumberingAfterBreak="0">
+  <w:abstractNum w:abstractNumId="32" w15:restartNumberingAfterBreak="0">
     <w:nsid w:val="582F516B"/>
     <w:multiLevelType w:val="multilevel"/>
     <w:tmpl w:val="792A9B1A"/>
@@ -6454,7 +6739,7 @@
       </w:rPr>
     </w:lvl>
   </w:abstractNum>
-  <w:abstractNum w:abstractNumId="32" w15:restartNumberingAfterBreak="0">
+  <w:abstractNum w:abstractNumId="33" w15:restartNumberingAfterBreak="0">
     <w:nsid w:val="5A6A554A"/>
     <w:multiLevelType w:val="hybridMultilevel"/>
     <w:tmpl w:val="8F18F060"/>
@@ -6567,7 +6852,7 @@
       </w:rPr>
     </w:lvl>
   </w:abstractNum>
-  <w:abstractNum w:abstractNumId="33" w15:restartNumberingAfterBreak="0">
+  <w:abstractNum w:abstractNumId="34" w15:restartNumberingAfterBreak="0">
     <w:nsid w:val="5C7C3EB7"/>
     <w:multiLevelType w:val="hybridMultilevel"/>
     <w:tmpl w:val="8CECABC0"/>
@@ -6680,7 +6965,7 @@
       </w:rPr>
     </w:lvl>
   </w:abstractNum>
-  <w:abstractNum w:abstractNumId="34" w15:restartNumberingAfterBreak="0">
+  <w:abstractNum w:abstractNumId="35" w15:restartNumberingAfterBreak="0">
     <w:nsid w:val="5CB261EF"/>
     <w:multiLevelType w:val="hybridMultilevel"/>
     <w:tmpl w:val="99247F36"/>
@@ -6793,7 +7078,7 @@
       </w:rPr>
     </w:lvl>
   </w:abstractNum>
-  <w:abstractNum w:abstractNumId="35" w15:restartNumberingAfterBreak="0">
+  <w:abstractNum w:abstractNumId="36" w15:restartNumberingAfterBreak="0">
     <w:nsid w:val="5D624748"/>
     <w:multiLevelType w:val="multilevel"/>
     <w:tmpl w:val="9C68DA50"/>
@@ -6942,7 +7227,7 @@
       </w:rPr>
     </w:lvl>
   </w:abstractNum>
-  <w:abstractNum w:abstractNumId="36" w15:restartNumberingAfterBreak="0">
+  <w:abstractNum w:abstractNumId="37" w15:restartNumberingAfterBreak="0">
     <w:nsid w:val="5F2B4B09"/>
     <w:multiLevelType w:val="hybridMultilevel"/>
     <w:tmpl w:val="DA1CF584"/>
@@ -7055,7 +7340,7 @@
       </w:rPr>
     </w:lvl>
   </w:abstractNum>
-  <w:abstractNum w:abstractNumId="37" w15:restartNumberingAfterBreak="0">
+  <w:abstractNum w:abstractNumId="38" w15:restartNumberingAfterBreak="0">
     <w:nsid w:val="5F9F1EB2"/>
     <w:multiLevelType w:val="multilevel"/>
     <w:tmpl w:val="B5AAEF2E"/>
@@ -7204,7 +7489,120 @@
       </w:rPr>
     </w:lvl>
   </w:abstractNum>
-  <w:abstractNum w:abstractNumId="38" w15:restartNumberingAfterBreak="0">
+  <w:abstractNum w:abstractNumId="39" w15:restartNumberingAfterBreak="0">
+    <w:nsid w:val="5FFA4F9B"/>
+    <w:multiLevelType w:val="hybridMultilevel"/>
+    <w:tmpl w:val="5B16D42A"/>
+    <w:lvl w:ilvl="0" w:tplc="340A0001">
+      <w:start w:val="1"/>
+      <w:numFmt w:val="bullet"/>
+      <w:lvlText w:val=""/>
+      <w:lvlJc w:val="left"/>
+      <w:pPr>
+        <w:ind w:left="1080" w:hanging="360"/>
+      </w:pPr>
+      <w:rPr>
+        <w:rFonts w:ascii="Symbol" w:hAnsi="Symbol" w:hint="default"/>
+      </w:rPr>
+    </w:lvl>
+    <w:lvl w:ilvl="1" w:tplc="340A0003" w:tentative="1">
+      <w:start w:val="1"/>
+      <w:numFmt w:val="bullet"/>
+      <w:lvlText w:val="o"/>
+      <w:lvlJc w:val="left"/>
+      <w:pPr>
+        <w:ind w:left="1800" w:hanging="360"/>
+      </w:pPr>
+      <w:rPr>
+        <w:rFonts w:ascii="Courier New" w:hAnsi="Courier New" w:cs="Courier New" w:hint="default"/>
+      </w:rPr>
+    </w:lvl>
+    <w:lvl w:ilvl="2" w:tplc="340A0005" w:tentative="1">
+      <w:start w:val="1"/>
+      <w:numFmt w:val="bullet"/>
+      <w:lvlText w:val=""/>
+      <w:lvlJc w:val="left"/>
+      <w:pPr>
+        <w:ind w:left="2520" w:hanging="360"/>
+      </w:pPr>
+      <w:rPr>
+        <w:rFonts w:ascii="Wingdings" w:hAnsi="Wingdings" w:hint="default"/>
+      </w:rPr>
+    </w:lvl>
+    <w:lvl w:ilvl="3" w:tplc="340A0001" w:tentative="1">
+      <w:start w:val="1"/>
+      <w:numFmt w:val="bullet"/>
+      <w:lvlText w:val=""/>
+      <w:lvlJc w:val="left"/>
+      <w:pPr>
+        <w:ind w:left="3240" w:hanging="360"/>
+      </w:pPr>
+      <w:rPr>
+        <w:rFonts w:ascii="Symbol" w:hAnsi="Symbol" w:hint="default"/>
+      </w:rPr>
+    </w:lvl>
+    <w:lvl w:ilvl="4" w:tplc="340A0003" w:tentative="1">
+      <w:start w:val="1"/>
+      <w:numFmt w:val="bullet"/>
+      <w:lvlText w:val="o"/>
+      <w:lvlJc w:val="left"/>
+      <w:pPr>
+        <w:ind w:left="3960" w:hanging="360"/>
+      </w:pPr>
+      <w:rPr>
+        <w:rFonts w:ascii="Courier New" w:hAnsi="Courier New" w:cs="Courier New" w:hint="default"/>
+      </w:rPr>
+    </w:lvl>
+    <w:lvl w:ilvl="5" w:tplc="340A0005" w:tentative="1">
+      <w:start w:val="1"/>
+      <w:numFmt w:val="bullet"/>
+      <w:lvlText w:val=""/>
+      <w:lvlJc w:val="left"/>
+      <w:pPr>
+        <w:ind w:left="4680" w:hanging="360"/>
+      </w:pPr>
+      <w:rPr>
+        <w:rFonts w:ascii="Wingdings" w:hAnsi="Wingdings" w:hint="default"/>
+      </w:rPr>
+    </w:lvl>
+    <w:lvl w:ilvl="6" w:tplc="340A0001" w:tentative="1">
+      <w:start w:val="1"/>
+      <w:numFmt w:val="bullet"/>
+      <w:lvlText w:val=""/>
+      <w:lvlJc w:val="left"/>
+      <w:pPr>
+        <w:ind w:left="5400" w:hanging="360"/>
+      </w:pPr>
+      <w:rPr>
+        <w:rFonts w:ascii="Symbol" w:hAnsi="Symbol" w:hint="default"/>
+      </w:rPr>
+    </w:lvl>
+    <w:lvl w:ilvl="7" w:tplc="340A0003" w:tentative="1">
+      <w:start w:val="1"/>
+      <w:numFmt w:val="bullet"/>
+      <w:lvlText w:val="o"/>
+      <w:lvlJc w:val="left"/>
+      <w:pPr>
+        <w:ind w:left="6120" w:hanging="360"/>
+      </w:pPr>
+      <w:rPr>
+        <w:rFonts w:ascii="Courier New" w:hAnsi="Courier New" w:cs="Courier New" w:hint="default"/>
+      </w:rPr>
+    </w:lvl>
+    <w:lvl w:ilvl="8" w:tplc="340A0005" w:tentative="1">
+      <w:start w:val="1"/>
+      <w:numFmt w:val="bullet"/>
+      <w:lvlText w:val=""/>
+      <w:lvlJc w:val="left"/>
+      <w:pPr>
+        <w:ind w:left="6840" w:hanging="360"/>
+      </w:pPr>
+      <w:rPr>
+        <w:rFonts w:ascii="Wingdings" w:hAnsi="Wingdings" w:hint="default"/>
+      </w:rPr>
+    </w:lvl>
+  </w:abstractNum>
+  <w:abstractNum w:abstractNumId="40" w15:restartNumberingAfterBreak="0">
     <w:nsid w:val="65507916"/>
     <w:multiLevelType w:val="multilevel"/>
     <w:tmpl w:val="4AF28ADC"/>
@@ -7353,7 +7751,7 @@
       </w:rPr>
     </w:lvl>
   </w:abstractNum>
-  <w:abstractNum w:abstractNumId="39" w15:restartNumberingAfterBreak="0">
+  <w:abstractNum w:abstractNumId="41" w15:restartNumberingAfterBreak="0">
     <w:nsid w:val="656D4203"/>
     <w:multiLevelType w:val="hybridMultilevel"/>
     <w:tmpl w:val="826ABFDC"/>
@@ -7466,7 +7864,7 @@
       </w:rPr>
     </w:lvl>
   </w:abstractNum>
-  <w:abstractNum w:abstractNumId="40" w15:restartNumberingAfterBreak="0">
+  <w:abstractNum w:abstractNumId="42" w15:restartNumberingAfterBreak="0">
     <w:nsid w:val="65C3251B"/>
     <w:multiLevelType w:val="multilevel"/>
     <w:tmpl w:val="51581236"/>
@@ -7615,7 +8013,7 @@
       </w:rPr>
     </w:lvl>
   </w:abstractNum>
-  <w:abstractNum w:abstractNumId="41" w15:restartNumberingAfterBreak="0">
+  <w:abstractNum w:abstractNumId="43" w15:restartNumberingAfterBreak="0">
     <w:nsid w:val="6669259E"/>
     <w:multiLevelType w:val="multilevel"/>
     <w:tmpl w:val="CEBC7FE8"/>
@@ -7764,7 +8162,7 @@
       </w:rPr>
     </w:lvl>
   </w:abstractNum>
-  <w:abstractNum w:abstractNumId="42" w15:restartNumberingAfterBreak="0">
+  <w:abstractNum w:abstractNumId="44" w15:restartNumberingAfterBreak="0">
     <w:nsid w:val="6A51629A"/>
     <w:multiLevelType w:val="multilevel"/>
     <w:tmpl w:val="D8AE0C4E"/>
@@ -7913,7 +8311,7 @@
       </w:rPr>
     </w:lvl>
   </w:abstractNum>
-  <w:abstractNum w:abstractNumId="43" w15:restartNumberingAfterBreak="0">
+  <w:abstractNum w:abstractNumId="45" w15:restartNumberingAfterBreak="0">
     <w:nsid w:val="6E03379C"/>
     <w:multiLevelType w:val="multilevel"/>
     <w:tmpl w:val="48B22EEE"/>
@@ -8062,7 +8460,7 @@
       </w:rPr>
     </w:lvl>
   </w:abstractNum>
-  <w:abstractNum w:abstractNumId="44" w15:restartNumberingAfterBreak="0">
+  <w:abstractNum w:abstractNumId="46" w15:restartNumberingAfterBreak="0">
     <w:nsid w:val="74FC4BFE"/>
     <w:multiLevelType w:val="multilevel"/>
     <w:tmpl w:val="296445EC"/>
@@ -8211,7 +8609,7 @@
       </w:rPr>
     </w:lvl>
   </w:abstractNum>
-  <w:abstractNum w:abstractNumId="45" w15:restartNumberingAfterBreak="0">
+  <w:abstractNum w:abstractNumId="47" w15:restartNumberingAfterBreak="0">
     <w:nsid w:val="77071C66"/>
     <w:multiLevelType w:val="multilevel"/>
     <w:tmpl w:val="7B9EF48C"/>
@@ -8360,7 +8758,7 @@
       </w:rPr>
     </w:lvl>
   </w:abstractNum>
-  <w:abstractNum w:abstractNumId="46" w15:restartNumberingAfterBreak="0">
+  <w:abstractNum w:abstractNumId="48" w15:restartNumberingAfterBreak="0">
     <w:nsid w:val="77776909"/>
     <w:multiLevelType w:val="hybridMultilevel"/>
     <w:tmpl w:val="8562792E"/>
@@ -8473,7 +8871,7 @@
       </w:rPr>
     </w:lvl>
   </w:abstractNum>
-  <w:abstractNum w:abstractNumId="47" w15:restartNumberingAfterBreak="0">
+  <w:abstractNum w:abstractNumId="49" w15:restartNumberingAfterBreak="0">
     <w:nsid w:val="79655E12"/>
     <w:multiLevelType w:val="hybridMultilevel"/>
     <w:tmpl w:val="97CE4398"/>
@@ -8586,7 +8984,7 @@
       </w:rPr>
     </w:lvl>
   </w:abstractNum>
-  <w:abstractNum w:abstractNumId="48" w15:restartNumberingAfterBreak="0">
+  <w:abstractNum w:abstractNumId="50" w15:restartNumberingAfterBreak="0">
     <w:nsid w:val="7AE2132D"/>
     <w:multiLevelType w:val="multilevel"/>
     <w:tmpl w:val="BB9826E4"/>
@@ -8739,64 +9137,64 @@
     <w:abstractNumId w:val="12"/>
   </w:num>
   <w:num w:numId="2" w16cid:durableId="1732145495">
-    <w:abstractNumId w:val="25"/>
+    <w:abstractNumId w:val="26"/>
   </w:num>
   <w:num w:numId="3" w16cid:durableId="1593734125">
-    <w:abstractNumId w:val="45"/>
+    <w:abstractNumId w:val="47"/>
   </w:num>
   <w:num w:numId="4" w16cid:durableId="1000083027">
     <w:abstractNumId w:val="0"/>
   </w:num>
   <w:num w:numId="5" w16cid:durableId="1581334490">
-    <w:abstractNumId w:val="30"/>
+    <w:abstractNumId w:val="31"/>
   </w:num>
   <w:num w:numId="6" w16cid:durableId="1563441019">
-    <w:abstractNumId w:val="36"/>
+    <w:abstractNumId w:val="37"/>
   </w:num>
   <w:num w:numId="7" w16cid:durableId="5444885">
-    <w:abstractNumId w:val="44"/>
+    <w:abstractNumId w:val="46"/>
   </w:num>
   <w:num w:numId="8" w16cid:durableId="280839280">
-    <w:abstractNumId w:val="15"/>
+    <w:abstractNumId w:val="16"/>
   </w:num>
   <w:num w:numId="9" w16cid:durableId="474107563">
-    <w:abstractNumId w:val="39"/>
+    <w:abstractNumId w:val="41"/>
   </w:num>
   <w:num w:numId="10" w16cid:durableId="1736388967">
     <w:abstractNumId w:val="11"/>
   </w:num>
   <w:num w:numId="11" w16cid:durableId="648245066">
-    <w:abstractNumId w:val="33"/>
+    <w:abstractNumId w:val="34"/>
   </w:num>
   <w:num w:numId="12" w16cid:durableId="461071375">
-    <w:abstractNumId w:val="34"/>
+    <w:abstractNumId w:val="35"/>
   </w:num>
   <w:num w:numId="13" w16cid:durableId="565847753">
-    <w:abstractNumId w:val="19"/>
+    <w:abstractNumId w:val="20"/>
   </w:num>
   <w:num w:numId="14" w16cid:durableId="1814711281">
-    <w:abstractNumId w:val="46"/>
+    <w:abstractNumId w:val="48"/>
   </w:num>
   <w:num w:numId="15" w16cid:durableId="1408531789">
-    <w:abstractNumId w:val="47"/>
+    <w:abstractNumId w:val="49"/>
   </w:num>
   <w:num w:numId="16" w16cid:durableId="1904175951">
     <w:abstractNumId w:val="4"/>
   </w:num>
   <w:num w:numId="17" w16cid:durableId="378088025">
-    <w:abstractNumId w:val="32"/>
+    <w:abstractNumId w:val="33"/>
   </w:num>
   <w:num w:numId="18" w16cid:durableId="1696729229">
-    <w:abstractNumId w:val="43"/>
+    <w:abstractNumId w:val="45"/>
   </w:num>
   <w:num w:numId="19" w16cid:durableId="1380277158">
     <w:abstractNumId w:val="10"/>
   </w:num>
   <w:num w:numId="20" w16cid:durableId="429280142">
-    <w:abstractNumId w:val="29"/>
+    <w:abstractNumId w:val="30"/>
   </w:num>
   <w:num w:numId="21" w16cid:durableId="1070274666">
-    <w:abstractNumId w:val="37"/>
+    <w:abstractNumId w:val="38"/>
   </w:num>
   <w:num w:numId="22" w16cid:durableId="756249654">
     <w:abstractNumId w:val="5"/>
@@ -8805,13 +9203,13 @@
     <w:abstractNumId w:val="6"/>
   </w:num>
   <w:num w:numId="24" w16cid:durableId="1402289901">
-    <w:abstractNumId w:val="26"/>
+    <w:abstractNumId w:val="27"/>
   </w:num>
   <w:num w:numId="25" w16cid:durableId="1426807886">
-    <w:abstractNumId w:val="38"/>
+    <w:abstractNumId w:val="40"/>
   </w:num>
   <w:num w:numId="26" w16cid:durableId="1881818956">
-    <w:abstractNumId w:val="35"/>
+    <w:abstractNumId w:val="36"/>
   </w:num>
   <w:num w:numId="27" w16cid:durableId="361856577">
     <w:abstractNumId w:val="3"/>
@@ -8820,13 +9218,13 @@
     <w:abstractNumId w:val="8"/>
   </w:num>
   <w:num w:numId="29" w16cid:durableId="803960942">
-    <w:abstractNumId w:val="21"/>
+    <w:abstractNumId w:val="22"/>
   </w:num>
   <w:num w:numId="30" w16cid:durableId="2056390136">
-    <w:abstractNumId w:val="40"/>
+    <w:abstractNumId w:val="42"/>
   </w:num>
   <w:num w:numId="31" w16cid:durableId="2131126109">
-    <w:abstractNumId w:val="27"/>
+    <w:abstractNumId w:val="28"/>
   </w:num>
   <w:num w:numId="32" w16cid:durableId="1262182956">
     <w:abstractNumId w:val="1"/>
@@ -8835,52 +9233,58 @@
     <w:abstractNumId w:val="9"/>
   </w:num>
   <w:num w:numId="34" w16cid:durableId="1197738827">
-    <w:abstractNumId w:val="42"/>
+    <w:abstractNumId w:val="44"/>
   </w:num>
   <w:num w:numId="35" w16cid:durableId="1127238834">
-    <w:abstractNumId w:val="14"/>
+    <w:abstractNumId w:val="15"/>
   </w:num>
   <w:num w:numId="36" w16cid:durableId="212228956">
-    <w:abstractNumId w:val="20"/>
+    <w:abstractNumId w:val="21"/>
   </w:num>
   <w:num w:numId="37" w16cid:durableId="739401316">
     <w:abstractNumId w:val="7"/>
   </w:num>
   <w:num w:numId="38" w16cid:durableId="1875075872">
-    <w:abstractNumId w:val="23"/>
+    <w:abstractNumId w:val="24"/>
   </w:num>
   <w:num w:numId="39" w16cid:durableId="1925650572">
-    <w:abstractNumId w:val="16"/>
+    <w:abstractNumId w:val="17"/>
   </w:num>
   <w:num w:numId="40" w16cid:durableId="1753894300">
-    <w:abstractNumId w:val="31"/>
+    <w:abstractNumId w:val="32"/>
   </w:num>
   <w:num w:numId="41" w16cid:durableId="924921527">
-    <w:abstractNumId w:val="41"/>
+    <w:abstractNumId w:val="43"/>
   </w:num>
   <w:num w:numId="42" w16cid:durableId="1938513473">
     <w:abstractNumId w:val="13"/>
   </w:num>
   <w:num w:numId="43" w16cid:durableId="1822842505">
-    <w:abstractNumId w:val="18"/>
+    <w:abstractNumId w:val="19"/>
   </w:num>
   <w:num w:numId="44" w16cid:durableId="1007907318">
-    <w:abstractNumId w:val="48"/>
+    <w:abstractNumId w:val="50"/>
   </w:num>
   <w:num w:numId="45" w16cid:durableId="1929342264">
-    <w:abstractNumId w:val="24"/>
+    <w:abstractNumId w:val="25"/>
   </w:num>
   <w:num w:numId="46" w16cid:durableId="385421749">
-    <w:abstractNumId w:val="28"/>
+    <w:abstractNumId w:val="29"/>
   </w:num>
   <w:num w:numId="47" w16cid:durableId="999162658">
     <w:abstractNumId w:val="2"/>
   </w:num>
   <w:num w:numId="48" w16cid:durableId="1588659283">
-    <w:abstractNumId w:val="17"/>
+    <w:abstractNumId w:val="18"/>
   </w:num>
   <w:num w:numId="49" w16cid:durableId="2059042455">
-    <w:abstractNumId w:val="22"/>
+    <w:abstractNumId w:val="23"/>
+  </w:num>
+  <w:num w:numId="50" w16cid:durableId="2136748673">
+    <w:abstractNumId w:val="14"/>
+  </w:num>
+  <w:num w:numId="51" w16cid:durableId="845511116">
+    <w:abstractNumId w:val="39"/>
   </w:num>
 </w:numbering>
 </file>

</xml_diff>